<commit_message>
Format Study 4 as a complete IJCM journal submission.
Rebuild the package to match Study 1: title page, blinded Word manuscript
(Times New Roman 12 pt, double spacing, line numbers), cover letter,
editable tables, 300 dpi Figure1–Figure5, and numbered Data_Study4_IJCM
folders 01–08. The English article uses a 216-word abstract, journal
end matter, and APA 7 references for International Journal of
Construction Management.

Co-authored-by: yuxuan980925 <yuxuan980925@users.noreply.github.com>
</commit_message>
<xml_diff>
--- a/Study4_IJCM_Submission/03_Cover_Letter.docx
+++ b/Study4_IJCM_Submission/03_Cover_Letter.docx
@@ -3,43 +3,232 @@
 <w:document xmlns:wpc="http://schemas.microsoft.com/office/word/2010/wordprocessingCanvas" xmlns:mo="http://schemas.microsoft.com/office/mac/office/2008/main" xmlns:mc="http://schemas.openxmlformats.org/markup-compatibility/2006" xmlns:mv="urn:schemas-microsoft-com:mac:vml" xmlns:o="urn:schemas-microsoft-com:office:office" xmlns:r="http://schemas.openxmlformats.org/officeDocument/2006/relationships" xmlns:m="http://schemas.openxmlformats.org/officeDocument/2006/math" xmlns:v="urn:schemas-microsoft-com:vml" xmlns:wp14="http://schemas.microsoft.com/office/word/2010/wordprocessingDrawing" xmlns:wp="http://schemas.openxmlformats.org/drawingml/2006/wordprocessingDrawing" xmlns:w10="urn:schemas-microsoft-com:office:word" xmlns:w="http://schemas.openxmlformats.org/wordprocessingml/2006/main" xmlns:w14="http://schemas.microsoft.com/office/word/2010/wordml" xmlns:wpg="http://schemas.microsoft.com/office/word/2010/wordprocessingGroup" xmlns:wpi="http://schemas.microsoft.com/office/word/2010/wordprocessingInk" xmlns:wne="http://schemas.microsoft.com/office/word/2006/wordml" xmlns:wps="http://schemas.microsoft.com/office/word/2010/wordprocessingShape" mc:Ignorable="w14 wp14">
   <w:body>
     <w:p>
+      <w:pPr>
+        <w:spacing w:line="480" w:lineRule="auto" w:after="0"/>
+        <w:ind w:firstLine="0"/>
+      </w:pPr>
       <w:r>
+        <w:rPr>
+          <w:rFonts w:ascii="Times New Roman" w:hAnsi="Times New Roman" w:eastAsia="Times New Roman"/>
+          <w:b w:val="0"/>
+          <w:i w:val="0"/>
+          <w:sz w:val="24"/>
+        </w:rPr>
+        <w:t>Yuxuan Chai</w:t>
+      </w:r>
+    </w:p>
+    <w:p>
+      <w:pPr>
+        <w:spacing w:line="480" w:lineRule="auto" w:after="0"/>
+        <w:ind w:firstLine="0"/>
+      </w:pPr>
+      <w:r>
+        <w:rPr>
+          <w:rFonts w:ascii="Times New Roman" w:hAnsi="Times New Roman" w:eastAsia="Times New Roman"/>
+          <w:b w:val="0"/>
+          <w:i w:val="0"/>
+          <w:sz w:val="24"/>
+        </w:rPr>
+        <w:t>University of Strathclyde, Glasgow, United Kingdom</w:t>
+      </w:r>
+    </w:p>
+    <w:p>
+      <w:pPr>
+        <w:spacing w:line="480" w:lineRule="auto" w:after="0"/>
+        <w:ind w:firstLine="0"/>
+      </w:pPr>
+      <w:r>
+        <w:rPr>
+          <w:rFonts w:ascii="Times New Roman" w:hAnsi="Times New Roman" w:eastAsia="Times New Roman"/>
+          <w:b w:val="0"/>
+          <w:i w:val="0"/>
+          <w:sz w:val="24"/>
+        </w:rPr>
+        <w:t>yuxuanchai98@outlook.com</w:t>
+      </w:r>
+    </w:p>
+    <w:p>
+      <w:pPr>
+        <w:spacing w:line="480" w:lineRule="auto" w:after="0"/>
+        <w:ind w:firstLine="0"/>
+      </w:pPr>
+      <w:r>
+        <w:rPr>
+          <w:rFonts w:ascii="Times New Roman" w:hAnsi="Times New Roman" w:eastAsia="Times New Roman"/>
+          <w:b w:val="0"/>
+          <w:i w:val="0"/>
+          <w:sz w:val="24"/>
+        </w:rPr>
+        <w:t>18 September 2026</w:t>
+      </w:r>
+    </w:p>
+    <w:p/>
+    <w:p>
+      <w:pPr>
+        <w:spacing w:line="480" w:lineRule="auto" w:after="0"/>
+        <w:ind w:firstLine="0"/>
+      </w:pPr>
+      <w:r>
+        <w:rPr>
+          <w:rFonts w:ascii="Times New Roman" w:hAnsi="Times New Roman" w:eastAsia="Times New Roman"/>
+          <w:b w:val="0"/>
+          <w:i w:val="0"/>
+          <w:sz w:val="24"/>
+        </w:rPr>
+        <w:t>Editor-in-Chief, International Journal of Construction Management</w:t>
+      </w:r>
+    </w:p>
+    <w:p/>
+    <w:p>
+      <w:pPr>
+        <w:spacing w:line="480" w:lineRule="auto" w:after="0"/>
+        <w:ind w:firstLine="0"/>
+      </w:pPr>
+      <w:r>
+        <w:rPr>
+          <w:rFonts w:ascii="Times New Roman" w:hAnsi="Times New Roman" w:eastAsia="Times New Roman"/>
+          <w:b w:val="0"/>
+          <w:i w:val="0"/>
+          <w:sz w:val="24"/>
+        </w:rPr>
         <w:t>Dear Editor,</w:t>
       </w:r>
     </w:p>
     <w:p>
+      <w:pPr>
+        <w:spacing w:line="480" w:lineRule="auto" w:after="0"/>
+        <w:ind w:firstLine="720"/>
+      </w:pPr>
       <w:r>
-        <w:t>I am submitting the manuscript “How Does the Civil Engineering Industry Economy Change under an AI Shock? The United Kingdom’s Service Links with India and China” for consideration in the International Journal of Construction Management.</w:t>
+        <w:rPr>
+          <w:rFonts w:ascii="Times New Roman" w:hAnsi="Times New Roman" w:eastAsia="Times New Roman"/>
+          <w:b w:val="0"/>
+          <w:i w:val="0"/>
+          <w:sz w:val="24"/>
+        </w:rPr>
+        <w:t>Please consider the enclosed original research article, “How Does the Civil Engineering Industry Economy Change under an AI Shock? The United Kingdom’s Service Links with India and China”, for publication in the International Journal of Construction Management.</w:t>
       </w:r>
     </w:p>
     <w:p>
+      <w:pPr>
+        <w:spacing w:line="480" w:lineRule="auto" w:after="0"/>
+        <w:ind w:firstLine="720"/>
+      </w:pPr>
       <w:r>
-        <w:t>The manuscript examines how the initial diffusion of natural-language generation is associated with architectural and engineering activity and with the United Kingdom’s services relationships with India and China. It distinguishes NACE M71 engineering consultancies from construction and separates technical-business, construction and computer service flows. The evidence uses retrieved Eurostat and OECD–WTO BaTIS data, with full replication materials supplied.</w:t>
+        <w:rPr>
+          <w:rFonts w:ascii="Times New Roman" w:hAnsi="Times New Roman" w:eastAsia="Times New Roman"/>
+          <w:b w:val="0"/>
+          <w:i w:val="0"/>
+          <w:sz w:val="24"/>
+        </w:rPr>
+        <w:t>The manuscript examines how the initial diffusion of natural-language-generation AI is associated with architectural and engineering activity (NACE M71) and with the United Kingdom’s services relationships with India and China. It distinguishes engineering consultancies from construction contractors, and technical-business, construction and computer service flows. The evidence uses retrieved Eurostat and OECD–WTO BaTIS series. No missing country, industry or trade cell is interpolated.</w:t>
       </w:r>
     </w:p>
     <w:p>
+      <w:pPr>
+        <w:spacing w:line="480" w:lineRule="auto" w:after="0"/>
+        <w:ind w:firstLine="720"/>
+      </w:pPr>
       <w:r>
-        <w:t>The corresponding author must confirm in the submission portal that the work is original, is not under consideration elsewhere, that all authors approve submission, and that funding and competing-interest declarations are complete. Those confirmations are not inferred or made by this file.</w:t>
+        <w:rPr>
+          <w:rFonts w:ascii="Times New Roman" w:hAnsi="Times New Roman" w:eastAsia="Times New Roman"/>
+          <w:b w:val="0"/>
+          <w:i w:val="0"/>
+          <w:sz w:val="24"/>
+        </w:rPr>
+        <w:t>I confirm that the work is original, has not been published, and is not under consideration elsewhere. I am the sole author and approve this submission. There are no competing interests. The research received no specific grant from any funding agency. A complete replication package is supplied as supplementary material.</w:t>
       </w:r>
     </w:p>
     <w:p>
+      <w:pPr>
+        <w:spacing w:line="480" w:lineRule="auto" w:after="0"/>
+        <w:ind w:firstLine="0"/>
+      </w:pPr>
       <w:r>
-        <w:t>Sincerely,</w:t>
+        <w:rPr>
+          <w:rFonts w:ascii="Times New Roman" w:hAnsi="Times New Roman" w:eastAsia="Times New Roman"/>
+          <w:b w:val="0"/>
+          <w:i w:val="0"/>
+          <w:sz w:val="24"/>
+        </w:rPr>
+        <w:t>Yours sincerely,</w:t>
+      </w:r>
+    </w:p>
+    <w:p/>
+    <w:p>
+      <w:pPr>
+        <w:spacing w:line="480" w:lineRule="auto" w:after="0"/>
+        <w:ind w:firstLine="0"/>
+      </w:pPr>
+      <w:r>
+        <w:rPr>
+          <w:rFonts w:ascii="Times New Roman" w:hAnsi="Times New Roman" w:eastAsia="Times New Roman"/>
+          <w:b w:val="0"/>
+          <w:i w:val="0"/>
+          <w:sz w:val="24"/>
+        </w:rPr>
+        <w:t>Yuxuan Chai</w:t>
       </w:r>
     </w:p>
     <w:p>
+      <w:pPr>
+        <w:spacing w:line="480" w:lineRule="auto" w:after="0"/>
+        <w:ind w:firstLine="0"/>
+      </w:pPr>
       <w:r>
-        <w:t>Yuxuan Chai</w:t>
+        <w:rPr>
+          <w:rFonts w:ascii="Times New Roman" w:hAnsi="Times New Roman" w:eastAsia="Times New Roman"/>
+          <w:b w:val="0"/>
+          <w:i w:val="0"/>
+          <w:sz w:val="24"/>
+        </w:rPr>
+        <w:t>University of Strathclyde, Glasgow, United Kingdom</w:t>
+      </w:r>
+    </w:p>
+    <w:p>
+      <w:pPr>
+        <w:spacing w:line="480" w:lineRule="auto" w:after="0"/>
+        <w:ind w:firstLine="0"/>
+      </w:pPr>
+      <w:r>
+        <w:rPr>
+          <w:rFonts w:ascii="Times New Roman" w:hAnsi="Times New Roman" w:eastAsia="Times New Roman"/>
+          <w:b w:val="0"/>
+          <w:i w:val="0"/>
+          <w:sz w:val="24"/>
+        </w:rPr>
+        <w:t>yuxuanchai98@outlook.com</w:t>
       </w:r>
     </w:p>
     <w:sectPr>
-      <w:pgSz w:w="12240" w:h="15840"/>
+      <w:footerReference w:type="default" r:id="rId9"/>
+      <w:pgSz w:w="11906" w:h="16838"/>
       <w:pgMar w:top="1440" w:right="1440" w:bottom="1440" w:left="1440" w:header="720" w:footer="720" w:gutter="0"/>
       <w:cols w:space="720"/>
       <w:docGrid w:linePitch="360"/>
     </w:sectPr>
   </w:body>
 </w:document>
+</file>
+
+<file path=word/footer1.xml><?xml version="1.0" encoding="utf-8"?>
+<w:ftr xmlns:m="http://schemas.openxmlformats.org/officeDocument/2006/math" xmlns:mc="http://schemas.openxmlformats.org/markup-compatibility/2006" xmlns:mo="http://schemas.microsoft.com/office/mac/office/2008/main" xmlns:mv="urn:schemas-microsoft-com:mac:vml" xmlns:o="urn:schemas-microsoft-com:office:office" xmlns:r="http://schemas.openxmlformats.org/officeDocument/2006/relationships" xmlns:v="urn:schemas-microsoft-com:vml" xmlns:w10="urn:schemas-microsoft-com:office:word" xmlns:w14="http://schemas.microsoft.com/office/word/2010/wordml" xmlns:w="http://schemas.openxmlformats.org/wordprocessingml/2006/main" xmlns:wne="http://schemas.microsoft.com/office/word/2006/wordml" xmlns:wp14="http://schemas.microsoft.com/office/word/2010/wordprocessingDrawing" xmlns:wp="http://schemas.openxmlformats.org/drawingml/2006/wordprocessingDrawing" xmlns:wpc="http://schemas.microsoft.com/office/word/2010/wordprocessingCanvas" xmlns:wpg="http://schemas.microsoft.com/office/word/2010/wordprocessingGroup" xmlns:wpi="http://schemas.microsoft.com/office/word/2010/wordprocessingInk" xmlns:wps="http://schemas.microsoft.com/office/word/2010/wordprocessingShape" mc:Ignorable="w14 wp14">
+  <w:p>
+    <w:pPr>
+      <w:pStyle w:val="Footer"/>
+      <w:jc w:val="center"/>
+    </w:pPr>
+    <w:r>
+      <w:rPr>
+        <w:rFonts w:ascii="Times New Roman" w:hAnsi="Times New Roman" w:eastAsia="Times New Roman"/>
+        <w:sz w:val="20"/>
+      </w:rPr>
+      <w:fldChar w:fldCharType="begin"/>
+      <w:instrText xml:space="preserve"> PAGE </w:instrText>
+      <w:fldChar w:fldCharType="end"/>
+    </w:r>
+  </w:p>
+</w:ftr>
 </file>
 
 <file path=word/numbering.xml><?xml version="1.0" encoding="utf-8"?>
@@ -406,10 +595,11 @@
     <w:qFormat/>
     <w:rsid w:val="00FC693F"/>
     <w:pPr>
-      <w:spacing w:line="360" w:lineRule="auto" w:after="0"/>
+      <w:spacing w:line="480" w:lineRule="auto" w:after="0" w:before="0"/>
     </w:pPr>
     <w:rPr>
       <w:rFonts w:ascii="Times New Roman" w:hAnsi="Times New Roman" w:eastAsia="Times New Roman"/>
+      <w:color w:val="000000"/>
       <w:sz w:val="24"/>
     </w:rPr>
   </w:style>
@@ -468,15 +658,15 @@
     <w:pPr>
       <w:keepNext/>
       <w:keepLines/>
-      <w:spacing w:before="480" w:after="0"/>
+      <w:spacing w:before="240" w:after="0" w:line="480" w:lineRule="auto"/>
       <w:outlineLvl w:val="0"/>
     </w:pPr>
     <w:rPr>
-      <w:rFonts w:asciiTheme="majorHAnsi" w:eastAsiaTheme="majorEastAsia" w:hAnsiTheme="majorHAnsi" w:cstheme="majorBidi"/>
+      <w:rFonts w:asciiTheme="majorHAnsi" w:eastAsiaTheme="majorEastAsia" w:hAnsiTheme="majorHAnsi" w:cstheme="majorBidi" w:ascii="Times New Roman" w:hAnsi="Times New Roman" w:eastAsia="Times New Roman"/>
       <w:b/>
       <w:bCs/>
-      <w:color w:val="365F91" w:themeColor="accent1" w:themeShade="BF"/>
-      <w:sz w:val="28"/>
+      <w:color w:val="000000"/>
+      <w:sz w:val="24"/>
       <w:szCs w:val="28"/>
     </w:rPr>
   </w:style>
@@ -492,15 +682,15 @@
     <w:pPr>
       <w:keepNext/>
       <w:keepLines/>
-      <w:spacing w:before="200" w:after="0"/>
+      <w:spacing w:before="240" w:after="0" w:line="480" w:lineRule="auto"/>
       <w:outlineLvl w:val="1"/>
     </w:pPr>
     <w:rPr>
-      <w:rFonts w:asciiTheme="majorHAnsi" w:eastAsiaTheme="majorEastAsia" w:hAnsiTheme="majorHAnsi" w:cstheme="majorBidi"/>
+      <w:rFonts w:asciiTheme="majorHAnsi" w:eastAsiaTheme="majorEastAsia" w:hAnsiTheme="majorHAnsi" w:cstheme="majorBidi" w:ascii="Times New Roman" w:hAnsi="Times New Roman" w:eastAsia="Times New Roman"/>
       <w:b/>
       <w:bCs/>
-      <w:color w:val="4F81BD" w:themeColor="accent1"/>
-      <w:sz w:val="26"/>
+      <w:color w:val="000000"/>
+      <w:sz w:val="24"/>
       <w:szCs w:val="26"/>
     </w:rPr>
   </w:style>
@@ -516,14 +706,15 @@
     <w:pPr>
       <w:keepNext/>
       <w:keepLines/>
-      <w:spacing w:before="200" w:after="0"/>
+      <w:spacing w:before="240" w:after="0" w:line="480" w:lineRule="auto"/>
       <w:outlineLvl w:val="2"/>
     </w:pPr>
     <w:rPr>
-      <w:rFonts w:asciiTheme="majorHAnsi" w:eastAsiaTheme="majorEastAsia" w:hAnsiTheme="majorHAnsi" w:cstheme="majorBidi"/>
+      <w:rFonts w:asciiTheme="majorHAnsi" w:eastAsiaTheme="majorEastAsia" w:hAnsiTheme="majorHAnsi" w:cstheme="majorBidi" w:ascii="Times New Roman" w:hAnsi="Times New Roman" w:eastAsia="Times New Roman"/>
       <w:b/>
       <w:bCs/>
-      <w:color w:val="4F81BD" w:themeColor="accent1"/>
+      <w:color w:val="000000"/>
+      <w:sz w:val="24"/>
     </w:rPr>
   </w:style>
   <w:style w:type="paragraph" w:styleId="Heading4">
@@ -757,15 +948,16 @@
       <w:pBdr>
         <w:bottom w:val="single" w:sz="8" w:space="4" w:color="4F81BD" w:themeColor="accent1"/>
       </w:pBdr>
-      <w:spacing w:after="300" w:line="240" w:lineRule="auto"/>
+      <w:spacing w:after="0" w:line="480" w:lineRule="auto" w:before="240"/>
       <w:contextualSpacing/>
     </w:pPr>
     <w:rPr>
-      <w:rFonts w:asciiTheme="majorHAnsi" w:eastAsiaTheme="majorEastAsia" w:hAnsiTheme="majorHAnsi" w:cstheme="majorBidi"/>
-      <w:color w:val="17365D" w:themeColor="text2" w:themeShade="BF"/>
+      <w:rFonts w:asciiTheme="majorHAnsi" w:eastAsiaTheme="majorEastAsia" w:hAnsiTheme="majorHAnsi" w:cstheme="majorBidi" w:ascii="Times New Roman" w:hAnsi="Times New Roman" w:eastAsia="Times New Roman"/>
+      <w:b/>
+      <w:color w:val="000000"/>
       <w:spacing w:val="5"/>
       <w:kern w:val="28"/>
-      <w:sz w:val="52"/>
+      <w:sz w:val="32"/>
       <w:szCs w:val="52"/>
     </w:rPr>
   </w:style>

</xml_diff>